<commit_message>
Simplify the VPB HotStock script
Same beats and formatting; sentences broken into short plain statements.
Average sentence drops to about 10 words from roughly 25, longest 22 words,
and heavier phrasing (long subordinate chains, "chưa đánh đổi bằng",
"dư địa") replaced with everyday wording.

Co-Authored-By: Claude Opus 5 <noreply@anthropic.com>
Claude-Session: https://claude.ai/code/session_01QPsxWfyBSmSQjUzo5EDnm5
</commit_message>
<xml_diff>
--- a/HotStock_VPB_31July2026_script.docx
+++ b/HotStock_VPB_31July2026_script.docx
@@ -14,7 +14,7 @@
           <w:sz w:val="20"/>
           <w:szCs w:val="20"/>
         </w:rPr>
-        <w:t xml:space="preserve">Lợi nhuận cao nhất bốn năm… nhưng câu chuyện lớn nhất của VPBank lại nằm ở vốn?</w:t>
+        <w:t xml:space="preserve">Lợi nhuận cao nhất bốn năm, nhưng chuyện lớn nhất của VPBank lại là tăng vốn?</w:t>
       </w:r>
     </w:p>
     <w:p>
@@ -44,7 +44,7 @@
           <w:sz w:val="20"/>
           <w:szCs w:val="20"/>
         </w:rPr>
-        <w:t xml:space="preserve">Mùa kết quả kinh doanh bán niên 2026 phân hóa rất mạnh. NIM toàn ngành vẫn bị bào mòn bởi chi phí huy động, nợ xấu chưa hạ nhiệt, và không ít ngân hàng báo lãi đi lùi.</w:t>
+        <w:t xml:space="preserve">Nửa đầu năm 2026, ngành ngân hàng phân hóa rất rõ. Chi phí huy động cao làm mỏng biên lãi. Nợ xấu chưa giảm. Nhiều ngân hàng báo lãi đi lùi.</w:t>
       </w:r>
     </w:p>
     <w:p>
@@ -72,7 +72,7 @@
           <w:sz w:val="20"/>
           <w:szCs w:val="20"/>
         </w:rPr>
-        <w:t xml:space="preserve">Nhưng giữa bức tranh đó vẫn có những cái tên bứt hẳn lên. Và lần này, người dẫn đầu về tốc độ tăng trưởng không phải một ngân hàng quốc doanh, mà là một ngân hàng tư nhân: VPBank.</w:t>
+        <w:t xml:space="preserve">Nhưng vẫn có ngân hàng đi ngược. Lần này, người tăng trưởng nhanh nhất không phải một ngân hàng quốc doanh. Đó là một ngân hàng tư nhân: VPBank.</w:t>
       </w:r>
     </w:p>
     <w:p>
@@ -115,37 +115,52 @@
           <w:sz w:val="20"/>
           <w:szCs w:val="20"/>
         </w:rPr>
-        <w:t xml:space="preserve">Việt Nam đang đặt mục tiêu tăng trưởng GDP 10%. Để dòng vốn chảy đủ mạnh cho mục tiêu đó, tín dụng toàn hệ thống phải mở rộng nhanh — và ngân hàng nào muốn cho vay nhiều thì trước hết phải có đủ vốn.</w:t>
-      </w:r>
-    </w:p>
-    <w:p>
-      <w:pPr>
-        <w:spacing w:after="160" w:line="259" w:lineRule="auto"/>
-      </w:pPr>
-      <w:r>
-        <w:rPr>
-          <w:rFonts w:ascii="Noto Sans" w:cs="Noto Sans" w:eastAsia="Noto Sans" w:hAnsi="Noto Sans"/>
-          <w:b w:val="false"/>
-          <w:bCs w:val="false"/>
-          <w:sz w:val="20"/>
-          <w:szCs w:val="20"/>
-        </w:rPr>
-        <w:t xml:space="preserve">Đó là lý do 2026 trở thành năm tăng vốn của ngành ngân hàng. Riêng với nhóm nhận chuyển giao bắt buộc các ngân hàng yếu kém, Nghị định 69/2025 còn mở thêm một cánh cửa mà phần lớn ngành không có: room ngoại được nới lên tối đa 49%, thay vì 30%.</w:t>
-      </w:r>
-    </w:p>
-    <w:p>
-      <w:pPr>
-        <w:spacing w:after="160" w:line="259" w:lineRule="auto"/>
-      </w:pPr>
-      <w:r>
-        <w:rPr>
-          <w:rFonts w:ascii="Noto Sans" w:cs="Noto Sans" w:eastAsia="Noto Sans" w:hAnsi="Noto Sans"/>
-          <w:b w:val="false"/>
-          <w:bCs w:val="false"/>
-          <w:sz w:val="20"/>
-          <w:szCs w:val="20"/>
-        </w:rPr>
-        <w:t xml:space="preserve">VPBank nằm đúng giao điểm của hai câu chuyện này.</w:t>
+        <w:t xml:space="preserve">Việt Nam đặt mục tiêu GDP tăng 10%. Muốn vậy, tín dụng phải tăng mạnh. Mà muốn cho vay nhiều, ngân hàng phải có đủ vốn trước.</w:t>
+      </w:r>
+    </w:p>
+    <w:p>
+      <w:pPr>
+        <w:spacing w:after="160" w:line="259" w:lineRule="auto"/>
+      </w:pPr>
+      <w:r>
+        <w:rPr>
+          <w:rFonts w:ascii="Noto Sans" w:cs="Noto Sans" w:eastAsia="Noto Sans" w:hAnsi="Noto Sans"/>
+          <w:b w:val="false"/>
+          <w:bCs w:val="false"/>
+          <w:sz w:val="20"/>
+          <w:szCs w:val="20"/>
+        </w:rPr>
+        <w:t xml:space="preserve">Vì thế 2026 là năm tăng vốn của cả ngành.</w:t>
+      </w:r>
+    </w:p>
+    <w:p>
+      <w:pPr>
+        <w:spacing w:after="160" w:line="259" w:lineRule="auto"/>
+      </w:pPr>
+      <w:r>
+        <w:rPr>
+          <w:rFonts w:ascii="Noto Sans" w:cs="Noto Sans" w:eastAsia="Noto Sans" w:hAnsi="Noto Sans"/>
+          <w:b w:val="false"/>
+          <w:bCs w:val="false"/>
+          <w:sz w:val="20"/>
+          <w:szCs w:val="20"/>
+        </w:rPr>
+        <w:t xml:space="preserve">Riêng nhóm ngân hàng nhận chuyển giao các ngân hàng yếu kém còn có thêm một lợi thế. Nghị định 69/2025 cho phép nhóm này nới room ngoại lên tối đa 49%, thay vì 30% như thông thường.</w:t>
+      </w:r>
+    </w:p>
+    <w:p>
+      <w:pPr>
+        <w:spacing w:after="160" w:line="259" w:lineRule="auto"/>
+      </w:pPr>
+      <w:r>
+        <w:rPr>
+          <w:rFonts w:ascii="Noto Sans" w:cs="Noto Sans" w:eastAsia="Noto Sans" w:hAnsi="Noto Sans"/>
+          <w:b w:val="false"/>
+          <w:bCs w:val="false"/>
+          <w:sz w:val="20"/>
+          <w:szCs w:val="20"/>
+        </w:rPr>
+        <w:t xml:space="preserve">VPBank nằm ở giao điểm của hai câu chuyện đó.</w:t>
       </w:r>
     </w:p>
     <w:p>
@@ -208,22 +223,22 @@
           <w:sz w:val="20"/>
           <w:szCs w:val="20"/>
         </w:rPr>
-        <w:t xml:space="preserve">Lợi nhuận trước thuế hợp nhất nửa đầu năm đạt gần 18,900 tỷ đồng, tăng 68% so với cùng kỳ và đã hoàn thành khoảng 46% kế hoạch năm. Riêng quý 2 đạt 10,959 tỷ — mức cao nhất trong bốn năm. Tổng thu nhập hoạt động 43,400 tỷ, tăng 35.2%.</w:t>
-      </w:r>
-    </w:p>
-    <w:p>
-      <w:pPr>
-        <w:spacing w:after="160" w:line="259" w:lineRule="auto"/>
-      </w:pPr>
-      <w:r>
-        <w:rPr>
-          <w:rFonts w:ascii="Noto Sans" w:cs="Noto Sans" w:eastAsia="Noto Sans" w:hAnsi="Noto Sans"/>
-          <w:b w:val="false"/>
-          <w:bCs w:val="false"/>
-          <w:sz w:val="20"/>
-          <w:szCs w:val="20"/>
-        </w:rPr>
-        <w:t xml:space="preserve">Quy mô mở rộng tương ứng, nhưng chưa đánh đổi bằng chất lượng tài sản:</w:t>
+        <w:t xml:space="preserve">Lợi nhuận trước thuế nửa đầu năm đạt gần 18,900 tỷ đồng, tăng 68%. Ngân hàng đã đi được 46% kế hoạch năm. Riêng quý 2 lãi 10,959 tỷ, cao nhất bốn năm. Tổng thu nhập hoạt động 43,400 tỷ, tăng 35.2%.</w:t>
+      </w:r>
+    </w:p>
+    <w:p>
+      <w:pPr>
+        <w:spacing w:after="160" w:line="259" w:lineRule="auto"/>
+      </w:pPr>
+      <w:r>
+        <w:rPr>
+          <w:rFonts w:ascii="Noto Sans" w:cs="Noto Sans" w:eastAsia="Noto Sans" w:hAnsi="Noto Sans"/>
+          <w:b w:val="false"/>
+          <w:bCs w:val="false"/>
+          <w:sz w:val="20"/>
+          <w:szCs w:val="20"/>
+        </w:rPr>
+        <w:t xml:space="preserve">Quy mô cũng lớn nhanh, mà chất lượng tài sản chưa xấu đi:</w:t>
       </w:r>
     </w:p>
     <w:p>
@@ -243,7 +258,7 @@
           <w:sz w:val="20"/>
           <w:szCs w:val="20"/>
         </w:rPr>
-        <w:t xml:space="preserve">Tổng tài sản vượt 1.5 triệu tỷ đồng, tăng 19.2% so với đầu năm. Tín dụng ngân hàng mẹ tăng 24.6% từ đầu năm, thuộc nhóm cao nhất hệ thống. Trong khi đó nợ xấu ngân hàng mẹ theo Thông tư 31 vẫn quanh 2%, hợp nhất dưới 3%.</w:t>
+        <w:t xml:space="preserve">Tổng tài sản vượt 1.5 triệu tỷ đồng, tăng 19.2% so với đầu năm. Tín dụng ngân hàng mẹ tăng 24.6%, thuộc nhóm cao nhất hệ thống. Nợ xấu ngân hàng mẹ vẫn quanh 2%. Tính hợp nhất thì dưới 3%.</w:t>
       </w:r>
     </w:p>
     <w:p>
@@ -286,7 +301,7 @@
           <w:sz w:val="20"/>
           <w:szCs w:val="20"/>
         </w:rPr>
-        <w:t xml:space="preserve">Thứ hai, và đây mới là chất xúc tác ngắn hạn: câu chuyện tăng vốn.</w:t>
+        <w:t xml:space="preserve">Thứ hai là chất xúc tác ngắn hạn: tăng vốn.</w:t>
       </w:r>
     </w:p>
     <w:p>
@@ -314,7 +329,7 @@
           <w:sz w:val="20"/>
           <w:szCs w:val="20"/>
         </w:rPr>
-        <w:t xml:space="preserve">VPBank sẽ nâng vốn điều lệ từ 79,339 lên 106,243 tỷ đồng — mức cao nhất hệ thống ngân hàng. Kế hoạch chia làm hai bước, đều dự kiến trong quý 3 và quý 4 năm nay.</w:t>
+        <w:t xml:space="preserve">VPBank sẽ nâng vốn điều lệ từ 79,339 lên 106,243 tỷ đồng. Đây sẽ là mức cao nhất hệ thống ngân hàng. Kế hoạch có hai bước, đều làm trong quý 3 và quý 4 năm nay.</w:t>
       </w:r>
     </w:p>
     <w:p>
@@ -347,7 +362,7 @@
           <w:sz w:val="20"/>
           <w:szCs w:val="20"/>
         </w:rPr>
-        <w:t xml:space="preserve">Bước một, chia cổ tức bằng cổ phiếu tỷ lệ 26.04%, tương đương khoảng 2.06 tỷ cổ phiếu, lấy từ lợi nhuận sau thuế giữ lại.</w:t>
+        <w:t xml:space="preserve">Bước một: chia cổ tức bằng cổ phiếu, tỷ lệ 26.04%, tương đương khoảng 2.06 tỷ cổ phiếu.</w:t>
       </w:r>
     </w:p>
     <w:p>
@@ -367,22 +382,22 @@
           <w:sz w:val="20"/>
           <w:szCs w:val="20"/>
         </w:rPr>
-        <w:t xml:space="preserve">Bước hai, chào bán riêng lẻ 624 triệu cổ phiếu cho đối tác nước ngoài. Nếu hoàn tất, sở hữu nước ngoài có thể lên khoảng 34%.</w:t>
-      </w:r>
-    </w:p>
-    <w:p>
-      <w:pPr>
-        <w:spacing w:after="160" w:line="259" w:lineRule="auto"/>
-      </w:pPr>
-      <w:r>
-        <w:rPr>
-          <w:rFonts w:ascii="Noto Sans" w:cs="Noto Sans" w:eastAsia="Noto Sans" w:hAnsi="Noto Sans"/>
-          <w:b w:val="false"/>
-          <w:bCs w:val="false"/>
-          <w:sz w:val="20"/>
-          <w:szCs w:val="20"/>
-        </w:rPr>
-        <w:t xml:space="preserve">Và đây là điểm đáng chú ý nhất: vì đã nhận chuyển giao GPBank, trần room ngoại của VPBank có thể được nới tới 49% theo Nghị định 69. Hiện sở hữu nước ngoài mới ở mức 24.3% — dư địa còn rất rộng.</w:t>
+        <w:t xml:space="preserve">Bước hai: bán riêng lẻ 624 triệu cổ phiếu cho đối tác nước ngoài. Nếu xong, sở hữu nước ngoài có thể lên khoảng 34%.</w:t>
+      </w:r>
+    </w:p>
+    <w:p>
+      <w:pPr>
+        <w:spacing w:after="160" w:line="259" w:lineRule="auto"/>
+      </w:pPr>
+      <w:r>
+        <w:rPr>
+          <w:rFonts w:ascii="Noto Sans" w:cs="Noto Sans" w:eastAsia="Noto Sans" w:hAnsi="Noto Sans"/>
+          <w:b w:val="false"/>
+          <w:bCs w:val="false"/>
+          <w:sz w:val="20"/>
+          <w:szCs w:val="20"/>
+        </w:rPr>
+        <w:t xml:space="preserve">Điểm đáng chú ý nhất nằm ở đây. VPBank đã nhận chuyển giao GPBank, nên room ngoại có thể được nới tới 49%. Hiện nhà đầu tư ngoại mới nắm 24.3%. Dư địa còn rất rộng.</w:t>
       </w:r>
     </w:p>
     <w:p>
@@ -440,22 +455,22 @@
           <w:sz w:val="20"/>
           <w:szCs w:val="20"/>
         </w:rPr>
-        <w:t xml:space="preserve">Nhưng cần nói thẳng hai điều. Thứ nhất, nền so sánh nửa cuối 2025 rất cao, nên tốc độ tăng trưởng công bố sẽ chậm lại rõ trong nửa cuối năm nay — thực tế ngân hàng chỉ cần tăng khoảng 16% là đủ hoàn thành kế hoạch. Thứ hai, cổ phiếu sẽ pha loãng khoảng 21% sau khi chia cổ tức bằng cổ phiếu.</w:t>
-      </w:r>
-    </w:p>
-    <w:p>
-      <w:pPr>
-        <w:spacing w:after="160" w:line="259" w:lineRule="auto"/>
-      </w:pPr>
-      <w:r>
-        <w:rPr>
-          <w:rFonts w:ascii="Noto Sans" w:cs="Noto Sans" w:eastAsia="Noto Sans" w:hAnsi="Noto Sans"/>
-          <w:b w:val="false"/>
-          <w:bCs w:val="false"/>
-          <w:sz w:val="20"/>
-          <w:szCs w:val="20"/>
-        </w:rPr>
-        <w:t xml:space="preserve">Đây là câu chuyện tăng trưởng đi kèm chất xúc tác chính sách — không phải một cơ hội định giá rẻ.</w:t>
+        <w:t xml:space="preserve">Nhưng có hai điều cần nói rõ. Một là nền so sánh nửa cuối 2025 rất cao, nên con số tăng trưởng nửa cuối năm nay sẽ nhỏ lại. Ngân hàng chỉ cần tăng khoảng 16% là đủ kế hoạch. Hai là cổ phiếu sẽ pha loãng khoảng 21% sau khi chia cổ tức.</w:t>
+      </w:r>
+    </w:p>
+    <w:p>
+      <w:pPr>
+        <w:spacing w:after="160" w:line="259" w:lineRule="auto"/>
+      </w:pPr>
+      <w:r>
+        <w:rPr>
+          <w:rFonts w:ascii="Noto Sans" w:cs="Noto Sans" w:eastAsia="Noto Sans" w:hAnsi="Noto Sans"/>
+          <w:b w:val="false"/>
+          <w:bCs w:val="false"/>
+          <w:sz w:val="20"/>
+          <w:szCs w:val="20"/>
+        </w:rPr>
+        <w:t xml:space="preserve">Đây là câu chuyện tăng trưởng cộng thêm chính sách hỗ trợ. Không phải câu chuyện cổ phiếu rẻ.</w:t>
       </w:r>
     </w:p>
     <w:sectPr>

</xml_diff>

<commit_message>
Rewrite the VPB HotStock script to read naturally
The previous simplify pass over-corrected into telegraphic fragments
(average sentence 9.5 words, every paragraph a list of clipped statements).
This restores a spoken rhythm: connectives between clauses, varied sentence
length, and setup lines that lead into each number instead of announcing it.

Average sentence is now 14 words with a median of 12 and a 28-word maximum,
so it still reads aloud easily. Structure, bold pattern, formatting and every
figure are unchanged.

The markdown working copy is now generated from the same source as the
document, so the two cannot drift apart.

Co-Authored-By: Claude Opus 5 <noreply@anthropic.com>
Claude-Session: https://claude.ai/code/session_01QPsxWfyBSmSQjUzo5EDnm5
</commit_message>
<xml_diff>
--- a/HotStock_VPB_31July2026_script.docx
+++ b/HotStock_VPB_31July2026_script.docx
@@ -44,7 +44,7 @@
           <w:sz w:val="20"/>
           <w:szCs w:val="20"/>
         </w:rPr>
-        <w:t xml:space="preserve">Nửa đầu năm 2026, ngành ngân hàng phân hóa rất rõ. Chi phí huy động cao làm mỏng biên lãi. Nợ xấu chưa giảm. Nhiều ngân hàng báo lãi đi lùi.</w:t>
+        <w:t xml:space="preserve">Nửa đầu năm 2026, bức tranh ngành ngân hàng phân hóa khá rõ. Chi phí huy động vẫn cao nên biên lãi mỏng đi, nợ xấu thì chưa hạ nhiệt, và không ít ngân hàng phải báo lãi đi lùi.</w:t>
       </w:r>
     </w:p>
     <w:p>
@@ -72,7 +72,7 @@
           <w:sz w:val="20"/>
           <w:szCs w:val="20"/>
         </w:rPr>
-        <w:t xml:space="preserve">Nhưng vẫn có ngân hàng đi ngược. Lần này, người tăng trưởng nhanh nhất không phải một ngân hàng quốc doanh. Đó là một ngân hàng tư nhân: VPBank.</w:t>
+        <w:t xml:space="preserve">Nhưng cũng có những cái tên đi ngược lại. Điều thú vị là quán quân tăng trưởng lần này không nằm trong nhóm quốc doanh, mà là một ngân hàng tư nhân — VPBank.</w:t>
       </w:r>
     </w:p>
     <w:p>
@@ -115,52 +115,52 @@
           <w:sz w:val="20"/>
           <w:szCs w:val="20"/>
         </w:rPr>
-        <w:t xml:space="preserve">Việt Nam đặt mục tiêu GDP tăng 10%. Muốn vậy, tín dụng phải tăng mạnh. Mà muốn cho vay nhiều, ngân hàng phải có đủ vốn trước.</w:t>
-      </w:r>
-    </w:p>
-    <w:p>
-      <w:pPr>
-        <w:spacing w:after="160" w:line="259" w:lineRule="auto"/>
-      </w:pPr>
-      <w:r>
-        <w:rPr>
-          <w:rFonts w:ascii="Noto Sans" w:cs="Noto Sans" w:eastAsia="Noto Sans" w:hAnsi="Noto Sans"/>
-          <w:b w:val="false"/>
-          <w:bCs w:val="false"/>
-          <w:sz w:val="20"/>
-          <w:szCs w:val="20"/>
-        </w:rPr>
-        <w:t xml:space="preserve">Vì thế 2026 là năm tăng vốn của cả ngành.</w:t>
-      </w:r>
-    </w:p>
-    <w:p>
-      <w:pPr>
-        <w:spacing w:after="160" w:line="259" w:lineRule="auto"/>
-      </w:pPr>
-      <w:r>
-        <w:rPr>
-          <w:rFonts w:ascii="Noto Sans" w:cs="Noto Sans" w:eastAsia="Noto Sans" w:hAnsi="Noto Sans"/>
-          <w:b w:val="false"/>
-          <w:bCs w:val="false"/>
-          <w:sz w:val="20"/>
-          <w:szCs w:val="20"/>
-        </w:rPr>
-        <w:t xml:space="preserve">Riêng nhóm ngân hàng nhận chuyển giao các ngân hàng yếu kém còn có thêm một lợi thế. Nghị định 69/2025 cho phép nhóm này nới room ngoại lên tối đa 49%, thay vì 30% như thông thường.</w:t>
-      </w:r>
-    </w:p>
-    <w:p>
-      <w:pPr>
-        <w:spacing w:after="160" w:line="259" w:lineRule="auto"/>
-      </w:pPr>
-      <w:r>
-        <w:rPr>
-          <w:rFonts w:ascii="Noto Sans" w:cs="Noto Sans" w:eastAsia="Noto Sans" w:hAnsi="Noto Sans"/>
-          <w:b w:val="false"/>
-          <w:bCs w:val="false"/>
-          <w:sz w:val="20"/>
-          <w:szCs w:val="20"/>
-        </w:rPr>
-        <w:t xml:space="preserve">VPBank nằm ở giao điểm của hai câu chuyện đó.</w:t>
+        <w:t xml:space="preserve">Chúng ta đang nói tới mục tiêu tăng trưởng GDP 10%. Muốn đạt được, tín dụng phải chảy mạnh; mà muốn cho vay nhiều thì ngân hàng phải có đủ vốn trước đã.</w:t>
+      </w:r>
+    </w:p>
+    <w:p>
+      <w:pPr>
+        <w:spacing w:after="160" w:line="259" w:lineRule="auto"/>
+      </w:pPr>
+      <w:r>
+        <w:rPr>
+          <w:rFonts w:ascii="Noto Sans" w:cs="Noto Sans" w:eastAsia="Noto Sans" w:hAnsi="Noto Sans"/>
+          <w:b w:val="false"/>
+          <w:bCs w:val="false"/>
+          <w:sz w:val="20"/>
+          <w:szCs w:val="20"/>
+        </w:rPr>
+        <w:t xml:space="preserve">Vì vậy 2026 gần như là năm tăng vốn của cả ngành.</w:t>
+      </w:r>
+    </w:p>
+    <w:p>
+      <w:pPr>
+        <w:spacing w:after="160" w:line="259" w:lineRule="auto"/>
+      </w:pPr>
+      <w:r>
+        <w:rPr>
+          <w:rFonts w:ascii="Noto Sans" w:cs="Noto Sans" w:eastAsia="Noto Sans" w:hAnsi="Noto Sans"/>
+          <w:b w:val="false"/>
+          <w:bCs w:val="false"/>
+          <w:sz w:val="20"/>
+          <w:szCs w:val="20"/>
+        </w:rPr>
+        <w:t xml:space="preserve">Riêng với nhóm nhận chuyển giao ngân hàng yếu kém thì còn có thêm một lợi thế nữa. Theo Nghị định 69/2025, room ngoại của nhóm này có thể được nới lên tối đa 49%, thay vì trần 30% như thông thường.</w:t>
+      </w:r>
+    </w:p>
+    <w:p>
+      <w:pPr>
+        <w:spacing w:after="160" w:line="259" w:lineRule="auto"/>
+      </w:pPr>
+      <w:r>
+        <w:rPr>
+          <w:rFonts w:ascii="Noto Sans" w:cs="Noto Sans" w:eastAsia="Noto Sans" w:hAnsi="Noto Sans"/>
+          <w:b w:val="false"/>
+          <w:bCs w:val="false"/>
+          <w:sz w:val="20"/>
+          <w:szCs w:val="20"/>
+        </w:rPr>
+        <w:t xml:space="preserve">Và VPBank nằm đúng giao điểm của cả hai câu chuyện.</w:t>
       </w:r>
     </w:p>
     <w:p>
@@ -203,7 +203,7 @@
           <w:sz w:val="20"/>
           <w:szCs w:val="20"/>
         </w:rPr>
-        <w:t xml:space="preserve">Trước hết là con số:</w:t>
+        <w:t xml:space="preserve">Trước hết, hãy nhìn vào con số.</w:t>
       </w:r>
     </w:p>
     <w:p>
@@ -223,22 +223,22 @@
           <w:sz w:val="20"/>
           <w:szCs w:val="20"/>
         </w:rPr>
-        <w:t xml:space="preserve">Lợi nhuận trước thuế nửa đầu năm đạt gần 18,900 tỷ đồng, tăng 68%. Ngân hàng đã đi được 46% kế hoạch năm. Riêng quý 2 lãi 10,959 tỷ, cao nhất bốn năm. Tổng thu nhập hoạt động 43,400 tỷ, tăng 35.2%.</w:t>
-      </w:r>
-    </w:p>
-    <w:p>
-      <w:pPr>
-        <w:spacing w:after="160" w:line="259" w:lineRule="auto"/>
-      </w:pPr>
-      <w:r>
-        <w:rPr>
-          <w:rFonts w:ascii="Noto Sans" w:cs="Noto Sans" w:eastAsia="Noto Sans" w:hAnsi="Noto Sans"/>
-          <w:b w:val="false"/>
-          <w:bCs w:val="false"/>
-          <w:sz w:val="20"/>
-          <w:szCs w:val="20"/>
-        </w:rPr>
-        <w:t xml:space="preserve">Quy mô cho vay cũng lớn rất nhanh:</w:t>
+        <w:t xml:space="preserve">Lợi nhuận trước thuế nửa đầu năm đạt gần 18,900 tỷ đồng, tăng 68% so với cùng kỳ — mới nửa năm đã đi được 46% kế hoạch. Riêng quý 2 lãi 10,959 tỷ, mức cao nhất trong bốn năm trở lại đây, với tổng thu nhập hoạt động 43,400 tỷ, tăng 35.2%.</w:t>
+      </w:r>
+    </w:p>
+    <w:p>
+      <w:pPr>
+        <w:spacing w:after="160" w:line="259" w:lineRule="auto"/>
+      </w:pPr>
+      <w:r>
+        <w:rPr>
+          <w:rFonts w:ascii="Noto Sans" w:cs="Noto Sans" w:eastAsia="Noto Sans" w:hAnsi="Noto Sans"/>
+          <w:b w:val="false"/>
+          <w:bCs w:val="false"/>
+          <w:sz w:val="20"/>
+          <w:szCs w:val="20"/>
+        </w:rPr>
+        <w:t xml:space="preserve">Quy mô cũng nở ra rất nhanh.</w:t>
       </w:r>
     </w:p>
     <w:p>
@@ -258,22 +258,22 @@
           <w:sz w:val="20"/>
           <w:szCs w:val="20"/>
         </w:rPr>
-        <w:t xml:space="preserve">Tổng tài sản vượt 1.5 triệu tỷ đồng, tăng 19.2% so với đầu năm. Cho vay khách hàng tăng 40.4% so với cùng kỳ, và đã 5 quý liên tiếp tăng trên 30%.</w:t>
-      </w:r>
-    </w:p>
-    <w:p>
-      <w:pPr>
-        <w:spacing w:after="160" w:line="259" w:lineRule="auto"/>
-      </w:pPr>
-      <w:r>
-        <w:rPr>
-          <w:rFonts w:ascii="Noto Sans" w:cs="Noto Sans" w:eastAsia="Noto Sans" w:hAnsi="Noto Sans"/>
-          <w:b w:val="false"/>
-          <w:bCs w:val="false"/>
-          <w:sz w:val="20"/>
-          <w:szCs w:val="20"/>
-        </w:rPr>
-        <w:t xml:space="preserve">Điều đáng chú ý là nợ xấu không tăng theo:</w:t>
+        <w:t xml:space="preserve">Tổng tài sản đã vượt 1.5 triệu tỷ đồng, tăng 19.2% so với đầu năm, còn cho vay khách hàng tăng tới 40.4% so với cùng kỳ — và đây là quý thứ năm liên tiếp tăng trên 30%.</w:t>
+      </w:r>
+    </w:p>
+    <w:p>
+      <w:pPr>
+        <w:spacing w:after="160" w:line="259" w:lineRule="auto"/>
+      </w:pPr>
+      <w:r>
+        <w:rPr>
+          <w:rFonts w:ascii="Noto Sans" w:cs="Noto Sans" w:eastAsia="Noto Sans" w:hAnsi="Noto Sans"/>
+          <w:b w:val="false"/>
+          <w:bCs w:val="false"/>
+          <w:sz w:val="20"/>
+          <w:szCs w:val="20"/>
+        </w:rPr>
+        <w:t xml:space="preserve">Cho vay nhanh như vậy thì câu hỏi đầu tiên phải là nợ xấu. Và đây mới là phần đáng chú ý.</w:t>
       </w:r>
     </w:p>
     <w:p>
@@ -293,22 +293,22 @@
           <w:sz w:val="20"/>
           <w:szCs w:val="20"/>
         </w:rPr>
-        <w:t xml:space="preserve">Nợ xấu hợp nhất giảm còn 3.34%, từ đỉnh 6.7% giữa năm 2023. Đây là mức thấp nhất kể từ 2020. Chi phí tín dụng cũng giảm còn 2.24% dư nợ, từ gần 6% hồi 2021.</w:t>
-      </w:r>
-    </w:p>
-    <w:p>
-      <w:pPr>
-        <w:spacing w:after="160" w:line="259" w:lineRule="auto"/>
-      </w:pPr>
-      <w:r>
-        <w:rPr>
-          <w:rFonts w:ascii="Noto Sans" w:cs="Noto Sans" w:eastAsia="Noto Sans" w:hAnsi="Noto Sans"/>
-          <w:b w:val="false"/>
-          <w:bCs w:val="false"/>
-          <w:sz w:val="20"/>
-          <w:szCs w:val="20"/>
-        </w:rPr>
-        <w:t xml:space="preserve">Nói cách khác, lợi nhuận tăng mạnh phần lớn vì ngân hàng không còn phải trích lập dự phòng nhiều như trước.</w:t>
+        <w:t xml:space="preserve">Nợ xấu hợp nhất đã giảm về 3.34%, so với đỉnh 6.7% hồi giữa năm 2023 — thấp nhất kể từ 2020. Chi phí tín dụng cũng hạ từ gần 6% năm 2021 xuống còn 2.24% dư nợ.</w:t>
+      </w:r>
+    </w:p>
+    <w:p>
+      <w:pPr>
+        <w:spacing w:after="160" w:line="259" w:lineRule="auto"/>
+      </w:pPr>
+      <w:r>
+        <w:rPr>
+          <w:rFonts w:ascii="Noto Sans" w:cs="Noto Sans" w:eastAsia="Noto Sans" w:hAnsi="Noto Sans"/>
+          <w:b w:val="false"/>
+          <w:bCs w:val="false"/>
+          <w:sz w:val="20"/>
+          <w:szCs w:val="20"/>
+        </w:rPr>
+        <w:t xml:space="preserve">Nói cách khác, phần lớn đà tăng lợi nhuận đến từ việc ngân hàng không còn phải trích lập dự phòng nặng như giai đoạn trước.</w:t>
       </w:r>
     </w:p>
     <w:p>
@@ -351,7 +351,7 @@
           <w:sz w:val="20"/>
           <w:szCs w:val="20"/>
         </w:rPr>
-        <w:t xml:space="preserve">Thứ hai là chất xúc tác ngắn hạn: tăng vốn.</w:t>
+        <w:t xml:space="preserve">Còn chất xúc tác ngắn hạn thì nằm ở chuyện tăng vốn.</w:t>
       </w:r>
     </w:p>
     <w:p>
@@ -379,7 +379,7 @@
           <w:sz w:val="20"/>
           <w:szCs w:val="20"/>
         </w:rPr>
-        <w:t xml:space="preserve">VPBank sẽ nâng vốn điều lệ từ 79,339 lên 106,243 tỷ đồng. Đây sẽ là mức cao nhất hệ thống ngân hàng. Kế hoạch có hai bước, đều làm trong quý 3 và quý 4 năm nay.</w:t>
+        <w:t xml:space="preserve">VPBank dự kiến nâng vốn điều lệ từ 79,339 lên 106,243 tỷ đồng, và nếu hoàn tất sẽ là mức cao nhất hệ thống. Lộ trình gồm hai bước, đều rơi vào quý 3 và quý 4 năm nay.</w:t>
       </w:r>
     </w:p>
     <w:p>
@@ -412,7 +412,7 @@
           <w:sz w:val="20"/>
           <w:szCs w:val="20"/>
         </w:rPr>
-        <w:t xml:space="preserve">Bước một: chia cổ tức bằng cổ phiếu, tỷ lệ 26.04%, tương đương khoảng 2.06 tỷ cổ phiếu.</w:t>
+        <w:t xml:space="preserve">Bước một là chia cổ tức bằng cổ phiếu tỷ lệ 26.04%, tương đương khoảng 2.06 tỷ cổ phiếu.</w:t>
       </w:r>
     </w:p>
     <w:p>
@@ -432,22 +432,22 @@
           <w:sz w:val="20"/>
           <w:szCs w:val="20"/>
         </w:rPr>
-        <w:t xml:space="preserve">Bước hai: bán riêng lẻ 624 triệu cổ phiếu cho đối tác nước ngoài. Nếu xong, sở hữu nước ngoài có thể lên khoảng 34%.</w:t>
-      </w:r>
-    </w:p>
-    <w:p>
-      <w:pPr>
-        <w:spacing w:after="160" w:line="259" w:lineRule="auto"/>
-      </w:pPr>
-      <w:r>
-        <w:rPr>
-          <w:rFonts w:ascii="Noto Sans" w:cs="Noto Sans" w:eastAsia="Noto Sans" w:hAnsi="Noto Sans"/>
-          <w:b w:val="false"/>
-          <w:bCs w:val="false"/>
-          <w:sz w:val="20"/>
-          <w:szCs w:val="20"/>
-        </w:rPr>
-        <w:t xml:space="preserve">Điểm đáng chú ý nhất nằm ở đây. VPBank đã nhận chuyển giao GPBank, nên room ngoại có thể được nới tới 49%. Hiện nhà đầu tư ngoại mới nắm 24.3%. Dư địa còn rất rộng.</w:t>
+        <w:t xml:space="preserve">Bước hai là chào bán riêng lẻ 624 triệu cổ phiếu cho đối tác nước ngoài. Nếu thành công, sở hữu nước ngoài có thể lên khoảng 34%.</w:t>
+      </w:r>
+    </w:p>
+    <w:p>
+      <w:pPr>
+        <w:spacing w:after="160" w:line="259" w:lineRule="auto"/>
+      </w:pPr>
+      <w:r>
+        <w:rPr>
+          <w:rFonts w:ascii="Noto Sans" w:cs="Noto Sans" w:eastAsia="Noto Sans" w:hAnsi="Noto Sans"/>
+          <w:b w:val="false"/>
+          <w:bCs w:val="false"/>
+          <w:sz w:val="20"/>
+          <w:szCs w:val="20"/>
+        </w:rPr>
+        <w:t xml:space="preserve">Và điểm thú vị nhất nằm ở chỗ này: vì đã nhận chuyển giao GPBank, room ngoại của VPBank có thể được nới tới 49%. Hiện nhà đầu tư nước ngoài mới nắm 24.3%, nên dư địa vẫn còn khá rộng.</w:t>
       </w:r>
     </w:p>
     <w:p>
@@ -490,37 +490,37 @@
           <w:sz w:val="20"/>
           <w:szCs w:val="20"/>
         </w:rPr>
-        <w:t xml:space="preserve">Chúng tôi khuyến nghị MUA với VPB, giá mục tiêu 33,800 đồng.</w:t>
-      </w:r>
-    </w:p>
-    <w:p>
-      <w:pPr>
-        <w:spacing w:after="160" w:line="259" w:lineRule="auto"/>
-      </w:pPr>
-      <w:r>
-        <w:rPr>
-          <w:rFonts w:ascii="Noto Sans" w:cs="Noto Sans" w:eastAsia="Noto Sans" w:hAnsi="Noto Sans"/>
-          <w:b w:val="false"/>
-          <w:bCs w:val="false"/>
-          <w:sz w:val="20"/>
-          <w:szCs w:val="20"/>
-        </w:rPr>
-        <w:t xml:space="preserve">Nhưng có ba điều cần nói rõ. Một là nền so sánh nửa cuối 2025 rất cao, nên con số tăng trưởng nửa cuối năm nay sẽ nhỏ lại. Ngân hàng chỉ cần tăng khoảng 16% là đủ kế hoạch. Hai là cổ phiếu sẽ pha loãng khoảng 21% sau khi chia cổ tức. Ba là NIM đang mỏng dần và CASA giảm còn 11.5%.</w:t>
-      </w:r>
-    </w:p>
-    <w:p>
-      <w:pPr>
-        <w:spacing w:after="160" w:line="259" w:lineRule="auto"/>
-      </w:pPr>
-      <w:r>
-        <w:rPr>
-          <w:rFonts w:ascii="Noto Sans" w:cs="Noto Sans" w:eastAsia="Noto Sans" w:hAnsi="Noto Sans"/>
-          <w:b w:val="false"/>
-          <w:bCs w:val="false"/>
-          <w:sz w:val="20"/>
-          <w:szCs w:val="20"/>
-        </w:rPr>
-        <w:t xml:space="preserve">Đây là câu chuyện tăng trưởng cộng thêm chính sách hỗ trợ. Không phải câu chuyện cổ phiếu rẻ.</w:t>
+        <w:t xml:space="preserve">Với những yếu tố trên, chúng tôi khuyến nghị MUA cổ phiếu VPB, giá mục tiêu 33,800 đồng.</w:t>
+      </w:r>
+    </w:p>
+    <w:p>
+      <w:pPr>
+        <w:spacing w:after="160" w:line="259" w:lineRule="auto"/>
+      </w:pPr>
+      <w:r>
+        <w:rPr>
+          <w:rFonts w:ascii="Noto Sans" w:cs="Noto Sans" w:eastAsia="Noto Sans" w:hAnsi="Noto Sans"/>
+          <w:b w:val="false"/>
+          <w:bCs w:val="false"/>
+          <w:sz w:val="20"/>
+          <w:szCs w:val="20"/>
+        </w:rPr>
+        <w:t xml:space="preserve">Dù vậy cũng cần lưu ý vài điểm. Nền so sánh nửa cuối 2025 rất cao, nên con số tăng trưởng công bố trong nửa cuối năm nay sẽ nhỏ lại đáng kể. Thực tế, ngân hàng chỉ cần tăng khoảng 16% là đã hoàn thành kế hoạch. Bên cạnh đó, cổ phiếu sẽ pha loãng khoảng 21% sau khi chia cổ tức, trong khi NIM đang mỏng dần và CASA giảm còn 11.5%.</w:t>
+      </w:r>
+    </w:p>
+    <w:p>
+      <w:pPr>
+        <w:spacing w:after="160" w:line="259" w:lineRule="auto"/>
+      </w:pPr>
+      <w:r>
+        <w:rPr>
+          <w:rFonts w:ascii="Noto Sans" w:cs="Noto Sans" w:eastAsia="Noto Sans" w:hAnsi="Noto Sans"/>
+          <w:b w:val="false"/>
+          <w:bCs w:val="false"/>
+          <w:sz w:val="20"/>
+          <w:szCs w:val="20"/>
+        </w:rPr>
+        <w:t xml:space="preserve">Nhìn chung, đây là câu chuyện tăng trưởng có thêm chính sách hỗ trợ, chứ không phải câu chuyện cổ phiếu rẻ.</w:t>
       </w:r>
     </w:p>
     <w:sectPr>

</xml_diff>

<commit_message>
Tighten the VPB HotStock script to the length of the VCB/BID one
562 words against the reference's 565, down from 663 (a 15 percent cut). No
figure is dropped: the trimming is in connective padding, doubled lead-ins,
and restating what a number already says.

Adds render_script.py, which generates both the Word document and the
markdown copy from script_body.json and prints the length and sentence
statistics next to the VCB/BID reference, so future edits can be checked
against it instead of estimated.

Co-Authored-By: Claude Opus 5 <noreply@anthropic.com>
Claude-Session: https://claude.ai/code/session_01QPsxWfyBSmSQjUzo5EDnm5
</commit_message>
<xml_diff>
--- a/HotStock_VPB_31July2026_script.docx
+++ b/HotStock_VPB_31July2026_script.docx
@@ -44,7 +44,7 @@
           <w:sz w:val="20"/>
           <w:szCs w:val="20"/>
         </w:rPr>
-        <w:t xml:space="preserve">Nửa đầu năm 2026, bức tranh ngành ngân hàng phân hóa khá rõ. Chi phí huy động vẫn cao nên biên lãi mỏng đi, nợ xấu thì chưa hạ nhiệt, và không ít ngân hàng phải báo lãi đi lùi.</w:t>
+        <w:t xml:space="preserve">Nửa đầu năm 2026, ngành ngân hàng phân hóa khá rõ. Chi phí huy động vẫn cao nên biên lãi mỏng đi, nợ xấu chưa hạ nhiệt, và không ít ngân hàng báo lãi đi lùi.</w:t>
       </w:r>
     </w:p>
     <w:p>
@@ -72,7 +72,7 @@
           <w:sz w:val="20"/>
           <w:szCs w:val="20"/>
         </w:rPr>
-        <w:t xml:space="preserve">Nhưng cũng có những cái tên đi ngược lại. Điều thú vị là quán quân tăng trưởng lần này không nằm trong nhóm quốc doanh, mà là một ngân hàng tư nhân — VPBank.</w:t>
+        <w:t xml:space="preserve">Nhưng cũng có những cái tên đi ngược. Điều thú vị là quán quân tăng trưởng lần này không phải ngân hàng quốc doanh, mà là một ngân hàng tư nhân — VPBank.</w:t>
       </w:r>
     </w:p>
     <w:p>
@@ -115,7 +115,7 @@
           <w:sz w:val="20"/>
           <w:szCs w:val="20"/>
         </w:rPr>
-        <w:t xml:space="preserve">Chúng ta đang nói tới mục tiêu tăng trưởng GDP 10%. Muốn đạt được, tín dụng phải chảy mạnh; mà muốn cho vay nhiều thì ngân hàng phải có đủ vốn trước đã.</w:t>
+        <w:t xml:space="preserve">Việt Nam đặt mục tiêu GDP tăng 10%. Muốn vậy tín dụng phải chảy mạnh, mà muốn cho vay nhiều thì ngân hàng phải có đủ vốn trước.</w:t>
       </w:r>
     </w:p>
     <w:p>
@@ -145,7 +145,7 @@
           <w:sz w:val="20"/>
           <w:szCs w:val="20"/>
         </w:rPr>
-        <w:t xml:space="preserve">Riêng với nhóm nhận chuyển giao ngân hàng yếu kém thì còn có thêm một lợi thế nữa. Theo Nghị định 69/2025, room ngoại của nhóm này có thể được nới lên tối đa 49%, thay vì trần 30% như thông thường.</w:t>
+        <w:t xml:space="preserve">Riêng nhóm nhận chuyển giao ngân hàng yếu kém còn có thêm một lợi thế: theo Nghị định 69/2025, room ngoại có thể được nới lên tối đa 49% thay vì trần 30%.</w:t>
       </w:r>
     </w:p>
     <w:p>
@@ -203,7 +203,7 @@
           <w:sz w:val="20"/>
           <w:szCs w:val="20"/>
         </w:rPr>
-        <w:t xml:space="preserve">Trước hết, hãy nhìn vào con số.</w:t>
+        <w:t xml:space="preserve">Trước hết là con số.</w:t>
       </w:r>
     </w:p>
     <w:p>
@@ -223,7 +223,7 @@
           <w:sz w:val="20"/>
           <w:szCs w:val="20"/>
         </w:rPr>
-        <w:t xml:space="preserve">Lợi nhuận trước thuế nửa đầu năm đạt gần 18,900 tỷ đồng, tăng 68% so với cùng kỳ — mới nửa năm đã đi được 46% kế hoạch. Riêng quý 2 lãi 10,959 tỷ, mức cao nhất trong bốn năm trở lại đây, với tổng thu nhập hoạt động 43,400 tỷ, tăng 35.2%.</w:t>
+        <w:t xml:space="preserve">Lợi nhuận trước thuế nửa đầu năm đạt gần 18,900 tỷ đồng, tăng 68% — mới nửa năm đã đi được 46% kế hoạch. Riêng quý 2 lãi 10,959 tỷ, cao nhất bốn năm, với tổng thu nhập hoạt động 43,400 tỷ, tăng 35.2%.</w:t>
       </w:r>
     </w:p>
     <w:p>
@@ -258,22 +258,22 @@
           <w:sz w:val="20"/>
           <w:szCs w:val="20"/>
         </w:rPr>
-        <w:t xml:space="preserve">Tổng tài sản đã vượt 1.5 triệu tỷ đồng, tăng 19.2% so với đầu năm, còn cho vay khách hàng tăng tới 40.4% so với cùng kỳ — và đây là quý thứ năm liên tiếp tăng trên 30%.</w:t>
-      </w:r>
-    </w:p>
-    <w:p>
-      <w:pPr>
-        <w:spacing w:after="160" w:line="259" w:lineRule="auto"/>
-      </w:pPr>
-      <w:r>
-        <w:rPr>
-          <w:rFonts w:ascii="Noto Sans" w:cs="Noto Sans" w:eastAsia="Noto Sans" w:hAnsi="Noto Sans"/>
-          <w:b w:val="false"/>
-          <w:bCs w:val="false"/>
-          <w:sz w:val="20"/>
-          <w:szCs w:val="20"/>
-        </w:rPr>
-        <w:t xml:space="preserve">Cho vay nhanh như vậy thì câu hỏi đầu tiên phải là nợ xấu. Và đây mới là phần đáng chú ý.</w:t>
+        <w:t xml:space="preserve">Tổng tài sản vượt 1.5 triệu tỷ đồng, tăng 19.2% so với đầu năm; cho vay khách hàng tăng 40.4% so với cùng kỳ — quý thứ năm liên tiếp trên 30%.</w:t>
+      </w:r>
+    </w:p>
+    <w:p>
+      <w:pPr>
+        <w:spacing w:after="160" w:line="259" w:lineRule="auto"/>
+      </w:pPr>
+      <w:r>
+        <w:rPr>
+          <w:rFonts w:ascii="Noto Sans" w:cs="Noto Sans" w:eastAsia="Noto Sans" w:hAnsi="Noto Sans"/>
+          <w:b w:val="false"/>
+          <w:bCs w:val="false"/>
+          <w:sz w:val="20"/>
+          <w:szCs w:val="20"/>
+        </w:rPr>
+        <w:t xml:space="preserve">Cho vay nhanh như vậy, câu hỏi tiếp theo phải là nợ xấu.</w:t>
       </w:r>
     </w:p>
     <w:p>
@@ -293,22 +293,22 @@
           <w:sz w:val="20"/>
           <w:szCs w:val="20"/>
         </w:rPr>
-        <w:t xml:space="preserve">Nợ xấu hợp nhất đã giảm về 3.34%, so với đỉnh 6.7% hồi giữa năm 2023 — thấp nhất kể từ 2020. Chi phí tín dụng cũng hạ từ gần 6% năm 2021 xuống còn 2.24% dư nợ.</w:t>
-      </w:r>
-    </w:p>
-    <w:p>
-      <w:pPr>
-        <w:spacing w:after="160" w:line="259" w:lineRule="auto"/>
-      </w:pPr>
-      <w:r>
-        <w:rPr>
-          <w:rFonts w:ascii="Noto Sans" w:cs="Noto Sans" w:eastAsia="Noto Sans" w:hAnsi="Noto Sans"/>
-          <w:b w:val="false"/>
-          <w:bCs w:val="false"/>
-          <w:sz w:val="20"/>
-          <w:szCs w:val="20"/>
-        </w:rPr>
-        <w:t xml:space="preserve">Nói cách khác, phần lớn đà tăng lợi nhuận đến từ việc ngân hàng không còn phải trích lập dự phòng nặng như giai đoạn trước.</w:t>
+        <w:t xml:space="preserve">Nợ xấu hợp nhất giảm về 3.34%, so với đỉnh 6.7% giữa năm 2023 — thấp nhất kể từ 2020. Chi phí tín dụng cũng hạ từ gần 6% xuống còn 2.24% dư nợ.</w:t>
+      </w:r>
+    </w:p>
+    <w:p>
+      <w:pPr>
+        <w:spacing w:after="160" w:line="259" w:lineRule="auto"/>
+      </w:pPr>
+      <w:r>
+        <w:rPr>
+          <w:rFonts w:ascii="Noto Sans" w:cs="Noto Sans" w:eastAsia="Noto Sans" w:hAnsi="Noto Sans"/>
+          <w:b w:val="false"/>
+          <w:bCs w:val="false"/>
+          <w:sz w:val="20"/>
+          <w:szCs w:val="20"/>
+        </w:rPr>
+        <w:t xml:space="preserve">Nói cách khác, lợi nhuận tăng mạnh chủ yếu vì ngân hàng không còn phải trích lập nặng như trước.</w:t>
       </w:r>
     </w:p>
     <w:p>
@@ -351,7 +351,7 @@
           <w:sz w:val="20"/>
           <w:szCs w:val="20"/>
         </w:rPr>
-        <w:t xml:space="preserve">Còn chất xúc tác ngắn hạn thì nằm ở chuyện tăng vốn.</w:t>
+        <w:t xml:space="preserve">Chất xúc tác ngắn hạn nằm ở chuyện tăng vốn.</w:t>
       </w:r>
     </w:p>
     <w:p>
@@ -379,7 +379,7 @@
           <w:sz w:val="20"/>
           <w:szCs w:val="20"/>
         </w:rPr>
-        <w:t xml:space="preserve">VPBank dự kiến nâng vốn điều lệ từ 79,339 lên 106,243 tỷ đồng, và nếu hoàn tất sẽ là mức cao nhất hệ thống. Lộ trình gồm hai bước, đều rơi vào quý 3 và quý 4 năm nay.</w:t>
+        <w:t xml:space="preserve">VPBank dự kiến nâng vốn điều lệ từ 79,339 lên 106,243 tỷ đồng — mức cao nhất hệ thống. Lộ trình hai bước, đều rơi vào quý 3 và quý 4 năm nay.</w:t>
       </w:r>
     </w:p>
     <w:p>
@@ -412,7 +412,7 @@
           <w:sz w:val="20"/>
           <w:szCs w:val="20"/>
         </w:rPr>
-        <w:t xml:space="preserve">Bước một là chia cổ tức bằng cổ phiếu tỷ lệ 26.04%, tương đương khoảng 2.06 tỷ cổ phiếu.</w:t>
+        <w:t xml:space="preserve">Bước một: chia cổ tức bằng cổ phiếu tỷ lệ 26.04%, khoảng 2.06 tỷ cổ phiếu.</w:t>
       </w:r>
     </w:p>
     <w:p>
@@ -432,22 +432,22 @@
           <w:sz w:val="20"/>
           <w:szCs w:val="20"/>
         </w:rPr>
-        <w:t xml:space="preserve">Bước hai là chào bán riêng lẻ 624 triệu cổ phiếu cho đối tác nước ngoài. Nếu thành công, sở hữu nước ngoài có thể lên khoảng 34%.</w:t>
-      </w:r>
-    </w:p>
-    <w:p>
-      <w:pPr>
-        <w:spacing w:after="160" w:line="259" w:lineRule="auto"/>
-      </w:pPr>
-      <w:r>
-        <w:rPr>
-          <w:rFonts w:ascii="Noto Sans" w:cs="Noto Sans" w:eastAsia="Noto Sans" w:hAnsi="Noto Sans"/>
-          <w:b w:val="false"/>
-          <w:bCs w:val="false"/>
-          <w:sz w:val="20"/>
-          <w:szCs w:val="20"/>
-        </w:rPr>
-        <w:t xml:space="preserve">Và điểm thú vị nhất nằm ở chỗ này: vì đã nhận chuyển giao GPBank, room ngoại của VPBank có thể được nới tới 49%. Hiện nhà đầu tư nước ngoài mới nắm 24.3%, nên dư địa vẫn còn khá rộng.</w:t>
+        <w:t xml:space="preserve">Bước hai: chào bán riêng lẻ 624 triệu cổ phiếu cho đối tác nước ngoài, đưa sở hữu nước ngoài lên khoảng 34%.</w:t>
+      </w:r>
+    </w:p>
+    <w:p>
+      <w:pPr>
+        <w:spacing w:after="160" w:line="259" w:lineRule="auto"/>
+      </w:pPr>
+      <w:r>
+        <w:rPr>
+          <w:rFonts w:ascii="Noto Sans" w:cs="Noto Sans" w:eastAsia="Noto Sans" w:hAnsi="Noto Sans"/>
+          <w:b w:val="false"/>
+          <w:bCs w:val="false"/>
+          <w:sz w:val="20"/>
+          <w:szCs w:val="20"/>
+        </w:rPr>
+        <w:t xml:space="preserve">Đáng chú ý nhất: vì đã nhận chuyển giao GPBank, room ngoại của VPBank có thể được nới tới 49%. Hiện khối ngoại mới nắm 24.3%, dư địa còn rất rộng.</w:t>
       </w:r>
     </w:p>
     <w:p>
@@ -490,37 +490,37 @@
           <w:sz w:val="20"/>
           <w:szCs w:val="20"/>
         </w:rPr>
-        <w:t xml:space="preserve">Với những yếu tố trên, chúng tôi khuyến nghị MUA cổ phiếu VPB, giá mục tiêu 33,800 đồng.</w:t>
-      </w:r>
-    </w:p>
-    <w:p>
-      <w:pPr>
-        <w:spacing w:after="160" w:line="259" w:lineRule="auto"/>
-      </w:pPr>
-      <w:r>
-        <w:rPr>
-          <w:rFonts w:ascii="Noto Sans" w:cs="Noto Sans" w:eastAsia="Noto Sans" w:hAnsi="Noto Sans"/>
-          <w:b w:val="false"/>
-          <w:bCs w:val="false"/>
-          <w:sz w:val="20"/>
-          <w:szCs w:val="20"/>
-        </w:rPr>
-        <w:t xml:space="preserve">Dù vậy cũng cần lưu ý vài điểm. Nền so sánh nửa cuối 2025 rất cao, nên con số tăng trưởng công bố trong nửa cuối năm nay sẽ nhỏ lại đáng kể. Thực tế, ngân hàng chỉ cần tăng khoảng 16% là đã hoàn thành kế hoạch. Bên cạnh đó, cổ phiếu sẽ pha loãng khoảng 21% sau khi chia cổ tức, trong khi NIM đang mỏng dần và CASA giảm còn 11.5%.</w:t>
-      </w:r>
-    </w:p>
-    <w:p>
-      <w:pPr>
-        <w:spacing w:after="160" w:line="259" w:lineRule="auto"/>
-      </w:pPr>
-      <w:r>
-        <w:rPr>
-          <w:rFonts w:ascii="Noto Sans" w:cs="Noto Sans" w:eastAsia="Noto Sans" w:hAnsi="Noto Sans"/>
-          <w:b w:val="false"/>
-          <w:bCs w:val="false"/>
-          <w:sz w:val="20"/>
-          <w:szCs w:val="20"/>
-        </w:rPr>
-        <w:t xml:space="preserve">Nhìn chung, đây là câu chuyện tăng trưởng có thêm chính sách hỗ trợ, chứ không phải câu chuyện cổ phiếu rẻ.</w:t>
+        <w:t xml:space="preserve">Chúng tôi khuyến nghị MUA cổ phiếu VPB, giá mục tiêu 33,800 đồng.</w:t>
+      </w:r>
+    </w:p>
+    <w:p>
+      <w:pPr>
+        <w:spacing w:after="160" w:line="259" w:lineRule="auto"/>
+      </w:pPr>
+      <w:r>
+        <w:rPr>
+          <w:rFonts w:ascii="Noto Sans" w:cs="Noto Sans" w:eastAsia="Noto Sans" w:hAnsi="Noto Sans"/>
+          <w:b w:val="false"/>
+          <w:bCs w:val="false"/>
+          <w:sz w:val="20"/>
+          <w:szCs w:val="20"/>
+        </w:rPr>
+        <w:t xml:space="preserve">Dù vậy cần lưu ý vài điểm. Nền so sánh nửa cuối 2025 rất cao, nên tốc độ tăng nửa cuối năm nay sẽ chậm lại rõ — ngân hàng chỉ cần tăng khoảng 16% là đủ kế hoạch. Cổ phiếu cũng pha loãng khoảng 21% sau khi chia cổ tức, trong khi NIM mỏng dần và CASA giảm còn 11.5%.</w:t>
+      </w:r>
+    </w:p>
+    <w:p>
+      <w:pPr>
+        <w:spacing w:after="160" w:line="259" w:lineRule="auto"/>
+      </w:pPr>
+      <w:r>
+        <w:rPr>
+          <w:rFonts w:ascii="Noto Sans" w:cs="Noto Sans" w:eastAsia="Noto Sans" w:hAnsi="Noto Sans"/>
+          <w:b w:val="false"/>
+          <w:bCs w:val="false"/>
+          <w:sz w:val="20"/>
+          <w:szCs w:val="20"/>
+        </w:rPr>
+        <w:t xml:space="preserve">Nhìn chung, đây là câu chuyện tăng trưởng có chính sách hỗ trợ, chứ không phải câu chuyện cổ phiếu rẻ.</w:t>
       </w:r>
     </w:p>
     <w:sectPr>

</xml_diff>